<commit_message>
TC-42: refine FigureChecker messages and tests
</commit_message>
<xml_diff>
--- a/java-thesis-checker/src/test/resources/incorrect_figure.docx
+++ b/java-thesis-checker/src/test/resources/incorrect_figure.docx
@@ -4,12 +4,23 @@
   <w:body>
     <w:p>
       <w:pPr>
+        <w:jc w:val="both"/>
+      </w:pPr>
+      <w:r>
+        <w:t>Нижче наведено рисунок із навмисно неправильним форматуванням.</w:t>
+      </w:r>
+    </w:p>
+    <w:p>
+      <w:pPr>
         <w:jc w:val="left"/>
       </w:pPr>
       <w:r>
+        <w:t xml:space="preserve">Тестовий абзац, що містить рисунок: </w:t>
+      </w:r>
+      <w:r>
         <w:drawing>
           <wp:inline xmlns:a="http://schemas.openxmlformats.org/drawingml/2006/main" xmlns:pic="http://schemas.openxmlformats.org/drawingml/2006/picture">
-            <wp:extent cx="1828800" cy="1828800"/>
+            <wp:extent cx="4320000" cy="2160000"/>
             <wp:docPr id="1" name="Picture 1"/>
             <wp:cNvGraphicFramePr>
               <a:graphicFrameLocks noChangeAspect="1"/>
@@ -18,7 +29,7 @@
               <a:graphicData uri="http://schemas.openxmlformats.org/drawingml/2006/picture">
                 <pic:pic>
                   <pic:nvPicPr>
-                    <pic:cNvPr id="0" name="_temp_dummy_image.png"/>
+                    <pic:cNvPr id="0" name="test_figure.png"/>
                     <pic:cNvPicPr/>
                   </pic:nvPicPr>
                   <pic:blipFill>
@@ -30,7 +41,7 @@
                   <pic:spPr>
                     <a:xfrm>
                       <a:off x="0" y="0"/>
-                      <a:ext cx="1828800" cy="1828800"/>
+                      <a:ext cx="4320000" cy="2160000"/>
                     </a:xfrm>
                     <a:prstGeom prst="rect"/>
                   </pic:spPr>
@@ -46,10 +57,9 @@
         <w:jc w:val="center"/>
       </w:pPr>
       <w:r>
-        <w:t>Рис. 1. Приклад креслення</w:t>
+        <w:t>Рис. 1 Неправильний підпис рисунка</w:t>
       </w:r>
     </w:p>
-    <w:p/>
     <w:sectPr>
       <w:pgSz w:w="12240" w:h="15840"/>
       <w:pgMar w:top="1440" w:right="1800" w:bottom="1440" w:left="1800" w:header="720" w:footer="720" w:gutter="0"/>

</xml_diff>